<commit_message>
fix word table injection
</commit_message>
<xml_diff>
--- a/template_dok_penilai/template_makalah.docx
+++ b/template_dok_penilai/template_makalah.docx
@@ -671,20 +671,21 @@
     <w:tbl>
       <w:tblPr>
         <w:tblStyle w:val="TableGrid"/>
-        <w:tblW w:w="0" w:type="auto"/>
+        <w:tblW w:w="9337" w:type="dxa"/>
+        <w:tblLayout w:type="fixed"/>
         <w:tblLook w:val="04A0" w:firstRow="1" w:lastRow="0" w:firstColumn="1" w:lastColumn="0" w:noHBand="0" w:noVBand="1"/>
       </w:tblPr>
       <w:tblGrid>
-        <w:gridCol w:w="1965"/>
-        <w:gridCol w:w="2269"/>
-        <w:gridCol w:w="1497"/>
-        <w:gridCol w:w="1497"/>
-        <w:gridCol w:w="2071"/>
+        <w:gridCol w:w="704"/>
+        <w:gridCol w:w="3530"/>
+        <w:gridCol w:w="1701"/>
+        <w:gridCol w:w="1701"/>
+        <w:gridCol w:w="1701"/>
       </w:tblGrid>
       <w:tr>
         <w:tc>
           <w:tcPr>
-            <w:tcW w:w="1965" w:type="dxa"/>
+            <w:tcW w:w="704" w:type="dxa"/>
             <w:vMerge w:val="restart"/>
             <w:vAlign w:val="center"/>
           </w:tcPr>
@@ -721,7 +722,7 @@
         </w:tc>
         <w:tc>
           <w:tcPr>
-            <w:tcW w:w="2269" w:type="dxa"/>
+            <w:tcW w:w="3530" w:type="dxa"/>
             <w:vMerge w:val="restart"/>
             <w:vAlign w:val="center"/>
           </w:tcPr>
@@ -758,7 +759,7 @@
         </w:tc>
         <w:tc>
           <w:tcPr>
-            <w:tcW w:w="5065" w:type="dxa"/>
+            <w:tcW w:w="5103" w:type="dxa"/>
             <w:gridSpan w:val="3"/>
             <w:vAlign w:val="center"/>
           </w:tcPr>
@@ -797,7 +798,7 @@
       <w:tr>
         <w:tc>
           <w:tcPr>
-            <w:tcW w:w="1965" w:type="dxa"/>
+            <w:tcW w:w="704" w:type="dxa"/>
             <w:vMerge/>
             <w:vAlign w:val="center"/>
           </w:tcPr>
@@ -823,7 +824,7 @@
         </w:tc>
         <w:tc>
           <w:tcPr>
-            <w:tcW w:w="2269" w:type="dxa"/>
+            <w:tcW w:w="3530" w:type="dxa"/>
             <w:vMerge/>
             <w:vAlign w:val="center"/>
           </w:tcPr>
@@ -849,7 +850,7 @@
         </w:tc>
         <w:tc>
           <w:tcPr>
-            <w:tcW w:w="1497" w:type="dxa"/>
+            <w:tcW w:w="1701" w:type="dxa"/>
             <w:vAlign w:val="center"/>
           </w:tcPr>
           <w:p>
@@ -915,7 +916,7 @@
         </w:tc>
         <w:tc>
           <w:tcPr>
-            <w:tcW w:w="1497" w:type="dxa"/>
+            <w:tcW w:w="1701" w:type="dxa"/>
             <w:vAlign w:val="center"/>
           </w:tcPr>
           <w:p>
@@ -1000,7 +1001,7 @@
         </w:tc>
         <w:tc>
           <w:tcPr>
-            <w:tcW w:w="2071" w:type="dxa"/>
+            <w:tcW w:w="1701" w:type="dxa"/>
             <w:vAlign w:val="center"/>
           </w:tcPr>
           <w:p>
@@ -1068,7 +1069,7 @@
       <w:tr>
         <w:tc>
           <w:tcPr>
-            <w:tcW w:w="1965" w:type="dxa"/>
+            <w:tcW w:w="704" w:type="dxa"/>
             <w:vAlign w:val="center"/>
           </w:tcPr>
           <w:p>
@@ -1104,7 +1105,7 @@
         </w:tc>
         <w:tc>
           <w:tcPr>
-            <w:tcW w:w="2269" w:type="dxa"/>
+            <w:tcW w:w="3530" w:type="dxa"/>
             <w:vAlign w:val="center"/>
           </w:tcPr>
           <w:p>
@@ -1140,7 +1141,7 @@
         </w:tc>
         <w:tc>
           <w:tcPr>
-            <w:tcW w:w="1497" w:type="dxa"/>
+            <w:tcW w:w="1701" w:type="dxa"/>
             <w:vAlign w:val="center"/>
           </w:tcPr>
           <w:p>
@@ -1176,7 +1177,7 @@
         </w:tc>
         <w:tc>
           <w:tcPr>
-            <w:tcW w:w="1497" w:type="dxa"/>
+            <w:tcW w:w="1701" w:type="dxa"/>
             <w:vAlign w:val="center"/>
           </w:tcPr>
           <w:p>
@@ -1212,7 +1213,7 @@
         </w:tc>
         <w:tc>
           <w:tcPr>
-            <w:tcW w:w="2071" w:type="dxa"/>
+            <w:tcW w:w="1701" w:type="dxa"/>
             <w:vAlign w:val="center"/>
           </w:tcPr>
           <w:p>
@@ -1250,7 +1251,7 @@
       <w:tr>
         <w:tc>
           <w:tcPr>
-            <w:tcW w:w="1965" w:type="dxa"/>
+            <w:tcW w:w="704" w:type="dxa"/>
             <w:vAlign w:val="center"/>
           </w:tcPr>
           <w:p>
@@ -1282,7 +1283,7 @@
         </w:tc>
         <w:tc>
           <w:tcPr>
-            <w:tcW w:w="2269" w:type="dxa"/>
+            <w:tcW w:w="3530" w:type="dxa"/>
             <w:vAlign w:val="center"/>
           </w:tcPr>
           <w:p>
@@ -1313,7 +1314,7 @@
         </w:tc>
         <w:tc>
           <w:tcPr>
-            <w:tcW w:w="1497" w:type="dxa"/>
+            <w:tcW w:w="1701" w:type="dxa"/>
             <w:vAlign w:val="center"/>
           </w:tcPr>
           <w:p>
@@ -1345,7 +1346,7 @@
         </w:tc>
         <w:tc>
           <w:tcPr>
-            <w:tcW w:w="1497" w:type="dxa"/>
+            <w:tcW w:w="1701" w:type="dxa"/>
             <w:vAlign w:val="center"/>
           </w:tcPr>
           <w:p>
@@ -1377,7 +1378,7 @@
         </w:tc>
         <w:tc>
           <w:tcPr>
-            <w:tcW w:w="2071" w:type="dxa"/>
+            <w:tcW w:w="1701" w:type="dxa"/>
             <w:vAlign w:val="center"/>
           </w:tcPr>
           <w:p>
@@ -1448,7 +1449,7 @@
         </w:tc>
         <w:tc>
           <w:tcPr>
-            <w:tcW w:w="5065" w:type="dxa"/>
+            <w:tcW w:w="5103" w:type="dxa"/>
             <w:gridSpan w:val="3"/>
             <w:vAlign w:val="center"/>
           </w:tcPr>
@@ -3846,10 +3847,6 @@
 </file>
 
 <file path=customXml/item1.xml><?xml version="1.0" encoding="utf-8"?>
-<b:Sources xmlns:b="http://schemas.openxmlformats.org/officeDocument/2006/bibliography" xmlns="http://schemas.openxmlformats.org/officeDocument/2006/bibliography" SelectedStyle="\APA.XSL" StyleName="APA"/>
-</file>
-
-<file path=customXml/item2.xml><?xml version="1.0" encoding="utf-8"?>
 <s:customData xmlns="http://www.wps.cn/officeDocument/2013/wpsCustomData" xmlns:s="http://www.wps.cn/officeDocument/2013/wpsCustomData">
   <customSectProps>
     <customSectPr/>
@@ -3860,18 +3857,22 @@
 </s:customData>
 </file>
 
+<file path=customXml/item2.xml><?xml version="1.0" encoding="utf-8"?>
+<b:Sources xmlns:b="http://schemas.openxmlformats.org/officeDocument/2006/bibliography" xmlns="http://schemas.openxmlformats.org/officeDocument/2006/bibliography" SelectedStyle="\APA.XSL" StyleName="APA"/>
+</file>
+
 <file path=customXml/itemProps1.xml><?xml version="1.0" encoding="utf-8"?>
+<ds:datastoreItem xmlns:ds="http://schemas.openxmlformats.org/officeDocument/2006/customXml" ds:itemID="{B1977F7D-205B-4081-913C-38D41E755F92}">
+  <ds:schemaRefs>
+    <ds:schemaRef ds:uri="http://www.wps.cn/officeDocument/2013/wpsCustomData"/>
+  </ds:schemaRefs>
+</ds:datastoreItem>
+</file>
+
+<file path=customXml/itemProps2.xml><?xml version="1.0" encoding="utf-8"?>
 <ds:datastoreItem xmlns:ds="http://schemas.openxmlformats.org/officeDocument/2006/customXml" ds:itemID="{C20F03D2-0F99-4C16-9311-505F19EA54EC}">
   <ds:schemaRefs>
     <ds:schemaRef ds:uri="http://schemas.openxmlformats.org/officeDocument/2006/bibliography"/>
   </ds:schemaRefs>
 </ds:datastoreItem>
-</file>
-
-<file path=customXml/itemProps2.xml><?xml version="1.0" encoding="utf-8"?>
-<ds:datastoreItem xmlns:ds="http://schemas.openxmlformats.org/officeDocument/2006/customXml" ds:itemID="{B1977F7D-205B-4081-913C-38D41E755F92}">
-  <ds:schemaRefs>
-    <ds:schemaRef ds:uri="http://www.wps.cn/officeDocument/2013/wpsCustomData"/>
-  </ds:schemaRefs>
-</ds:datastoreItem>
 </file>
</xml_diff>